<commit_message>
docs: documentación al día tras el refactor (fases 1-5)
- README: las fases corren en src/pipeline/segment_runner.run_pipeline (main.py
  y run_batch.py); cortes fijos/baseline por evaluate_solution; MILP infactible =
  error explícito, sin optimizador de respaldo ("Solver and Infeasibility").
- CLAUDE.md: encabezado de fases; avisos operativos (coste del RI optimizer con
  200 trials, python3 del sistema es 3.9 → uv run, build_methodology_doc.py
  regenera el docx al ejecutarse, /data/ anclado en .gitignore).
- docs/methodology.docx regenerado (sección 9.7 sin GA/pymoo).
- docs/new_feature_specs.md: ruta src/core/utils.py.

Co-Authored-By: Claude Opus 5.5 <noreply@anthropic.com>
</commit_message>
<xml_diff>
--- a/docs/methodology.docx
+++ b/docs/methodology.docx
@@ -1154,7 +1154,7 @@
           </w:tcPr>
           <w:p>
             <w:r>
-              <w:t>MILP over monotonic cutoff combinations at ~50 risk targets; Pareto filter; optional GA fallback for N&gt;2 if infeasible</w:t>
+              <w:t>MILP over monotonic cutoff combinations at ~50 risk targets; Pareto filter; infeasible -&gt; explicit error</w:t>
             </w:r>
           </w:p>
         </w:tc>
@@ -5683,7 +5683,7 @@
         <w:rPr>
           <w:color w:val="143D6B"/>
         </w:rPr>
-        <w:t>9.7 Solver and fallbacks</w:t>
+        <w:t>9.7 Solver and infeasibility</w:t>
       </w:r>
     </w:p>
     <w:p>
@@ -5695,191 +5695,7 @@
           <w:b w:val="0"/>
           <w:i w:val="0"/>
         </w:rPr>
-        <w:t>The MILP is solved by scipy.optimize.milp (HiGHS backend) with a configurable time limit (milp_time_limit, default 30 seconds). If the solver returns infeasible — typically because of an aggressive risk target combined with tight swap-in caps — the platform falls back:</w:t>
-      </w:r>
-    </w:p>
-    <w:tbl>
-      <w:tblPr>
-        <w:tblStyle w:val="LightGrid-Accent1"/>
-        <w:tblW w:type="auto" w:w="0"/>
-        <w:tblLayout w:type="autofit"/>
-        <w:tblLook w:firstColumn="1" w:firstRow="1" w:lastColumn="0" w:lastRow="0" w:noHBand="0" w:noVBand="1" w:val="04A0"/>
-      </w:tblPr>
-      <w:tblGrid>
-        <w:gridCol w:w="3249"/>
-        <w:gridCol w:w="3249"/>
-        <w:gridCol w:w="3249"/>
-      </w:tblGrid>
-      <w:tr>
-        <w:tc>
-          <w:tcPr>
-            <w:tcW w:type="dxa" w:w="3249"/>
-            <w:shd w:val="clear" w:color="auto" w:fill="143D6B"/>
-            <w:vAlign w:val="center"/>
-          </w:tcPr>
-          <w:p>
-            <w:r/>
-            <w:r>
-              <w:rPr>
-                <w:b/>
-                <w:color w:val="FFFFFF"/>
-              </w:rPr>
-              <w:t>Case</w:t>
-            </w:r>
-          </w:p>
-        </w:tc>
-        <w:tc>
-          <w:tcPr>
-            <w:tcW w:type="dxa" w:w="3249"/>
-            <w:shd w:val="clear" w:color="auto" w:fill="143D6B"/>
-            <w:vAlign w:val="center"/>
-          </w:tcPr>
-          <w:p>
-            <w:r/>
-            <w:r>
-              <w:rPr>
-                <w:b/>
-                <w:color w:val="FFFFFF"/>
-              </w:rPr>
-              <w:t>Fallback</w:t>
-            </w:r>
-          </w:p>
-        </w:tc>
-        <w:tc>
-          <w:tcPr>
-            <w:tcW w:type="dxa" w:w="3249"/>
-            <w:shd w:val="clear" w:color="auto" w:fill="143D6B"/>
-            <w:vAlign w:val="center"/>
-          </w:tcPr>
-          <w:p>
-            <w:r/>
-            <w:r>
-              <w:rPr>
-                <w:b/>
-                <w:color w:val="FFFFFF"/>
-              </w:rPr>
-              <w:t>Why</w:t>
-            </w:r>
-          </w:p>
-        </w:tc>
-      </w:tr>
-      <w:tr>
-        <w:tc>
-          <w:tcPr>
-            <w:tcW w:type="dxa" w:w="3249"/>
-            <w:vAlign w:val="center"/>
-          </w:tcPr>
-          <w:p>
-            <w:r>
-              <w:t>N &gt; 2 dimensions, infeasible</w:t>
-            </w:r>
-          </w:p>
-        </w:tc>
-        <w:tc>
-          <w:tcPr>
-            <w:tcW w:type="dxa" w:w="3249"/>
-            <w:vAlign w:val="center"/>
-          </w:tcPr>
-          <w:p>
-            <w:r>
-              <w:t>Genetic algorithm via pymoo (NSGA-II)</w:t>
-            </w:r>
-          </w:p>
-        </w:tc>
-        <w:tc>
-          <w:tcPr>
-            <w:tcW w:type="dxa" w:w="3249"/>
-            <w:vAlign w:val="center"/>
-          </w:tcPr>
-          <w:p>
-            <w:r>
-              <w:t>Handles large combinatorial spaces; produces a near-optimal Pareto frontier rather than a single point.</w:t>
-            </w:r>
-          </w:p>
-        </w:tc>
-      </w:tr>
-      <w:tr>
-        <w:tc>
-          <w:tcPr>
-            <w:tcW w:type="dxa" w:w="3249"/>
-            <w:vAlign w:val="center"/>
-          </w:tcPr>
-          <w:p>
-            <w:r>
-              <w:t>N = 2 dimensions, infeasible</w:t>
-            </w:r>
-          </w:p>
-        </w:tc>
-        <w:tc>
-          <w:tcPr>
-            <w:tcW w:type="dxa" w:w="3249"/>
-            <w:vAlign w:val="center"/>
-          </w:tcPr>
-          <w:p>
-            <w:r>
-              <w:t>Legacy enumeration over all monotonic combinations</w:t>
-            </w:r>
-          </w:p>
-        </w:tc>
-        <w:tc>
-          <w:tcPr>
-            <w:tcW w:type="dxa" w:w="3249"/>
-            <w:vAlign w:val="center"/>
-          </w:tcPr>
-          <w:p>
-            <w:r>
-              <w:t>The 2D space is small enough to brute-force; produces the exact frontier.</w:t>
-            </w:r>
-          </w:p>
-        </w:tc>
-      </w:tr>
-      <w:tr>
-        <w:tc>
-          <w:tcPr>
-            <w:tcW w:type="dxa" w:w="3249"/>
-            <w:vAlign w:val="center"/>
-          </w:tcPr>
-          <w:p>
-            <w:r>
-              <w:t>MILP returns optimal</w:t>
-            </w:r>
-          </w:p>
-        </w:tc>
-        <w:tc>
-          <w:tcPr>
-            <w:tcW w:type="dxa" w:w="3249"/>
-            <w:vAlign w:val="center"/>
-          </w:tcPr>
-          <w:p>
-            <w:r>
-              <w:t>Use directly</w:t>
-            </w:r>
-          </w:p>
-        </w:tc>
-        <w:tc>
-          <w:tcPr>
-            <w:tcW w:type="dxa" w:w="3249"/>
-            <w:vAlign w:val="center"/>
-          </w:tcPr>
-          <w:p>
-            <w:r>
-              <w:t>Standard path</w:t>
-            </w:r>
-          </w:p>
-        </w:tc>
-      </w:tr>
-    </w:tbl>
-    <w:p/>
-    <w:p>
-      <w:pPr>
-        <w:spacing w:after="120"/>
-      </w:pPr>
-      <w:r>
-        <w:rPr>
-          <w:b w:val="0"/>
-          <w:i w:val="0"/>
-        </w:rPr>
-        <w:t>Every fallback is logged so reviewers can see when and why the exact solver did not return a solution. Fallback frequency is itself a methodology indicator: a segment that frequently falls back is signalling that its constraint set is over-binding.</w:t>
+        <w:t>The MILP is solved by scipy.optimize.milp (HiGHS backend) with a configurable time limit (milp_time_limit, default 30 seconds). There is no fallback optimizer: if no risk target is feasible — typically an aggressive target combined with tight swap-in caps, cell pins or cutoff-ordering constraints — the segment stops with an explicit error naming the active constraints. A heuristic fallback would either drop constraints or return a non-optimal frontier, so failing loudly is the safer governance behaviour; the analyst loosens a constraint and re-runs.</w:t>
       </w:r>
     </w:p>
     <w:p>

</xml_diff>

<commit_message>
docs: auditoría 2026-10-31 — informe, README, metodología y riesgo residual en la firma
- reports/validation/code_audit_2026_10_31.md: informe de la auditoría de segundo
  verificador (F1-F6 + seguimiento), con reproducción, corrección, PR e impacto MR.
- README: rechazo de la resimulación, HRI + RI optimizer, fallback de ci_upper y
  dónde se avisa, reconstrucción MR por cuenta (tiers 1-4, reparto del tier 2),
  filas de entrenamiento.
- docs/methodology.docx (sección 11.2) regenerado con la reconstrucción por cuenta.
- mrm_signoff.md: riesgo residual nº 6 — la reconstrucción MR cambió tras la firma
  (periodo principal sin cambios; MR ligeramente más conservador).
- CLAUDE.md: los informes de auditoría dentro del pack de validación.

Co-Authored-By: Claude Opus 5.5 <noreply@anthropic.com>
</commit_message>
<xml_diff>
--- a/docs/methodology.docx
+++ b/docs/methodology.docx
@@ -6911,6 +6911,18 @@
           <w:i w:val="0"/>
         </w:rPr>
         <w:t>Safeguards: bins where b2_main_h3 is approximately zero skip extrapolation; for power, bins where b2_main_h3 is NaN automatically fall back to linear; mr_extrapolation_risk_multiplier (default 3.0) caps extrapolated risk relative to main; mr_extrapolation_hard_cap (default 15%) caps absolute extrapolated risk.</w:t>
+      </w:r>
+    </w:p>
+    <w:p>
+      <w:pPr>
+        <w:spacing w:after="120"/>
+      </w:pPr>
+      <w:r>
+        <w:rPr>
+          <w:b w:val="0"/>
+          <w:i w:val="0"/>
+        </w:rPr>
+        <w:t>Account-level reconstruction. The MR surface is rebuilt per booked account by maturity: seasoned accounts keep their observed H6; accounts with 3 to 5 months of seasoning (tier 2) receive the bin's H3 -&gt; H6 forecast. That forecast is evaluated once per bin on the cohort's aggregate H3, t = max(curve(H3_bin), H3_bin), and allocated to the accounts in proportion to their own H3, normalised by the production-weighted mean H3 so the reconstructed bin rate equals t (the accounts' H6 exposure is pro-rated by production). Applying the nonlinear curve to each account's sparse H3 and averaging would not reproduce the curve at the bin level; this was corrected on 2026-10-31.</w:t>
       </w:r>
     </w:p>
     <w:p>

</xml_diff>